<commit_message>
docs: ER.docx 内嵌渲染版 ER 图（Mermaid → PNG）
</commit_message>
<xml_diff>
--- a/ER.docx
+++ b/ER.docx
@@ -122,1159 +122,44 @@
     </w:p>
     <w:p>
       <w:pPr>
-        <w:spacing w:after="0"/>
+        <w:jc w:val="center"/>
       </w:pPr>
       <w:r>
-        <w:rPr>
-          <w:rFonts w:ascii="Consolas" w:hAnsi="Consolas" w:eastAsia="微软雅黑"/>
-          <w:b w:val="0"/>
-          <w:i w:val="0"/>
-          <w:color w:val="404040"/>
-          <w:sz w:val="18"/>
-        </w:rPr>
-        <w:t>erDiagram</w:t>
+        <w:drawing>
+          <wp:inline xmlns:a="http://schemas.openxmlformats.org/drawingml/2006/main" xmlns:pic="http://schemas.openxmlformats.org/drawingml/2006/picture">
+            <wp:extent cx="5760000" cy="4860000"/>
+            <wp:docPr id="1" name="Picture 1"/>
+            <wp:cNvGraphicFramePr>
+              <a:graphicFrameLocks noChangeAspect="1"/>
+            </wp:cNvGraphicFramePr>
+            <a:graphic>
+              <a:graphicData uri="http://schemas.openxmlformats.org/drawingml/2006/picture">
+                <pic:pic>
+                  <pic:nvPicPr>
+                    <pic:cNvPr id="0" name="er_diagram.png"/>
+                    <pic:cNvPicPr/>
+                  </pic:nvPicPr>
+                  <pic:blipFill>
+                    <a:blip r:embed="rId9"/>
+                    <a:stretch>
+                      <a:fillRect/>
+                    </a:stretch>
+                  </pic:blipFill>
+                  <pic:spPr>
+                    <a:xfrm>
+                      <a:off x="0" y="0"/>
+                      <a:ext cx="5760000" cy="4860000"/>
+                    </a:xfrm>
+                    <a:prstGeom prst="rect"/>
+                  </pic:spPr>
+                </pic:pic>
+              </a:graphicData>
+            </a:graphic>
+          </wp:inline>
+        </w:drawing>
       </w:r>
     </w:p>
-    <w:p>
-      <w:pPr>
-        <w:spacing w:after="0"/>
-      </w:pPr>
-      <w:r>
-        <w:rPr>
-          <w:rFonts w:ascii="Consolas" w:hAnsi="Consolas" w:eastAsia="微软雅黑"/>
-          <w:b w:val="0"/>
-          <w:i w:val="0"/>
-          <w:color w:val="404040"/>
-          <w:sz w:val="18"/>
-        </w:rPr>
-        <w:t xml:space="preserve">    SUPPLIERS ||--o{ CHANNELS : "拥有"</w:t>
-      </w:r>
-    </w:p>
-    <w:p>
-      <w:pPr>
-        <w:spacing w:after="0"/>
-      </w:pPr>
-      <w:r>
-        <w:rPr>
-          <w:rFonts w:ascii="Consolas" w:hAnsi="Consolas" w:eastAsia="微软雅黑"/>
-          <w:b w:val="0"/>
-          <w:i w:val="0"/>
-          <w:color w:val="404040"/>
-          <w:sz w:val="18"/>
-        </w:rPr>
-        <w:t xml:space="preserve">    SUPPLIERS ||--o{ PRICES : "报价"</w:t>
-      </w:r>
-    </w:p>
-    <w:p>
-      <w:pPr>
-        <w:spacing w:after="0"/>
-      </w:pPr>
-      <w:r>
-        <w:rPr>
-          <w:rFonts w:ascii="Consolas" w:hAnsi="Consolas" w:eastAsia="微软雅黑"/>
-          <w:b w:val="0"/>
-          <w:i w:val="0"/>
-          <w:color w:val="404040"/>
-          <w:sz w:val="18"/>
-        </w:rPr>
-        <w:t xml:space="preserve">    SUPPLIERS ||--o{ SCHEDULES : "提供船期"</w:t>
-      </w:r>
-    </w:p>
-    <w:p>
-      <w:pPr>
-        <w:spacing w:after="0"/>
-      </w:pPr>
-      <w:r>
-        <w:rPr>
-          <w:rFonts w:ascii="Consolas" w:hAnsi="Consolas" w:eastAsia="微软雅黑"/>
-          <w:b w:val="0"/>
-          <w:i w:val="0"/>
-          <w:color w:val="404040"/>
-          <w:sz w:val="18"/>
-        </w:rPr>
-        <w:t xml:space="preserve">    SUPPLIERS ||--o{ BILLING_RULES : "制定计费规则"</w:t>
-      </w:r>
-    </w:p>
-    <w:p>
-      <w:pPr>
-        <w:spacing w:after="0"/>
-      </w:pPr>
-      <w:r>
-        <w:rPr>
-          <w:rFonts w:ascii="Consolas" w:hAnsi="Consolas" w:eastAsia="微软雅黑"/>
-          <w:b w:val="0"/>
-          <w:i w:val="0"/>
-          <w:color w:val="404040"/>
-          <w:sz w:val="18"/>
-        </w:rPr>
-        <w:t xml:space="preserve">    CHANNELS ||--o{ PRICES : "归类"</w:t>
-      </w:r>
-    </w:p>
-    <w:p>
-      <w:pPr>
-        <w:spacing w:after="0"/>
-      </w:pPr>
-      <w:r>
-        <w:rPr>
-          <w:rFonts w:ascii="Consolas" w:hAnsi="Consolas" w:eastAsia="微软雅黑"/>
-          <w:b w:val="0"/>
-          <w:i w:val="0"/>
-          <w:color w:val="404040"/>
-          <w:sz w:val="18"/>
-        </w:rPr>
-        <w:t xml:space="preserve">    CHANNELS ||--o{ SCHEDULES : "关联"</w:t>
-      </w:r>
-    </w:p>
-    <w:p>
-      <w:pPr>
-        <w:spacing w:after="0"/>
-      </w:pPr>
-      <w:r>
-        <w:rPr>
-          <w:rFonts w:ascii="Consolas" w:hAnsi="Consolas" w:eastAsia="微软雅黑"/>
-          <w:b w:val="0"/>
-          <w:i w:val="0"/>
-          <w:color w:val="404040"/>
-          <w:sz w:val="18"/>
-        </w:rPr>
-        <w:t xml:space="preserve">    DESTINATIONS ||--o{ PRICES : "指向"</w:t>
-      </w:r>
-    </w:p>
-    <w:p>
-      <w:pPr>
-        <w:spacing w:after="0"/>
-      </w:pPr>
-      <w:r>
-        <w:rPr>
-          <w:rFonts w:ascii="Consolas" w:hAnsi="Consolas" w:eastAsia="微软雅黑"/>
-          <w:b w:val="0"/>
-          <w:i w:val="0"/>
-          <w:color w:val="404040"/>
-          <w:sz w:val="18"/>
-        </w:rPr>
-        <w:t xml:space="preserve"> </w:t>
-      </w:r>
-    </w:p>
-    <w:p>
-      <w:pPr>
-        <w:spacing w:after="0"/>
-      </w:pPr>
-      <w:r>
-        <w:rPr>
-          <w:rFonts w:ascii="Consolas" w:hAnsi="Consolas" w:eastAsia="微软雅黑"/>
-          <w:b w:val="0"/>
-          <w:i w:val="0"/>
-          <w:color w:val="404040"/>
-          <w:sz w:val="18"/>
-        </w:rPr>
-        <w:t xml:space="preserve">    SUPPLIERS {</w:t>
-      </w:r>
-    </w:p>
-    <w:p>
-      <w:pPr>
-        <w:spacing w:after="0"/>
-      </w:pPr>
-      <w:r>
-        <w:rPr>
-          <w:rFonts w:ascii="Consolas" w:hAnsi="Consolas" w:eastAsia="微软雅黑"/>
-          <w:b w:val="0"/>
-          <w:i w:val="0"/>
-          <w:color w:val="404040"/>
-          <w:sz w:val="18"/>
-        </w:rPr>
-        <w:t xml:space="preserve">        string supplier_code "供应商编码(主键)"</w:t>
-      </w:r>
-    </w:p>
-    <w:p>
-      <w:pPr>
-        <w:spacing w:after="0"/>
-      </w:pPr>
-      <w:r>
-        <w:rPr>
-          <w:rFonts w:ascii="Consolas" w:hAnsi="Consolas" w:eastAsia="微软雅黑"/>
-          <w:b w:val="0"/>
-          <w:i w:val="0"/>
-          <w:color w:val="404040"/>
-          <w:sz w:val="18"/>
-        </w:rPr>
-        <w:t xml:space="preserve">        string supplier_name "供应商名称"</w:t>
-      </w:r>
-    </w:p>
-    <w:p>
-      <w:pPr>
-        <w:spacing w:after="0"/>
-      </w:pPr>
-      <w:r>
-        <w:rPr>
-          <w:rFonts w:ascii="Consolas" w:hAnsi="Consolas" w:eastAsia="微软雅黑"/>
-          <w:b w:val="0"/>
-          <w:i w:val="0"/>
-          <w:color w:val="404040"/>
-          <w:sz w:val="18"/>
-        </w:rPr>
-        <w:t xml:space="preserve">        string line_type "经营线路(US/EU/JP)"</w:t>
-      </w:r>
-    </w:p>
-    <w:p>
-      <w:pPr>
-        <w:spacing w:after="0"/>
-      </w:pPr>
-      <w:r>
-        <w:rPr>
-          <w:rFonts w:ascii="Consolas" w:hAnsi="Consolas" w:eastAsia="微软雅黑"/>
-          <w:b w:val="0"/>
-          <w:i w:val="0"/>
-          <w:color w:val="404040"/>
-          <w:sz w:val="18"/>
-        </w:rPr>
-        <w:t xml:space="preserve">        string status "状态(active/paused/archived)"</w:t>
-      </w:r>
-    </w:p>
-    <w:p>
-      <w:pPr>
-        <w:spacing w:after="0"/>
-      </w:pPr>
-      <w:r>
-        <w:rPr>
-          <w:rFonts w:ascii="Consolas" w:hAnsi="Consolas" w:eastAsia="微软雅黑"/>
-          <w:b w:val="0"/>
-          <w:i w:val="0"/>
-          <w:color w:val="404040"/>
-          <w:sz w:val="18"/>
-        </w:rPr>
-        <w:t xml:space="preserve">        text warehouse_locations "进仓点(JSON)"</w:t>
-      </w:r>
-    </w:p>
-    <w:p>
-      <w:pPr>
-        <w:spacing w:after="0"/>
-      </w:pPr>
-      <w:r>
-        <w:rPr>
-          <w:rFonts w:ascii="Consolas" w:hAnsi="Consolas" w:eastAsia="微软雅黑"/>
-          <w:b w:val="0"/>
-          <w:i w:val="0"/>
-          <w:color w:val="404040"/>
-          <w:sz w:val="18"/>
-        </w:rPr>
-        <w:t xml:space="preserve">        string price_list_date "价表日期"</w:t>
-      </w:r>
-    </w:p>
-    <w:p>
-      <w:pPr>
-        <w:spacing w:after="0"/>
-      </w:pPr>
-      <w:r>
-        <w:rPr>
-          <w:rFonts w:ascii="Consolas" w:hAnsi="Consolas" w:eastAsia="微软雅黑"/>
-          <w:b w:val="0"/>
-          <w:i w:val="0"/>
-          <w:color w:val="404040"/>
-          <w:sz w:val="18"/>
-        </w:rPr>
-        <w:t xml:space="preserve">        string price_expiry_date "价表失效日期"</w:t>
-      </w:r>
-    </w:p>
-    <w:p>
-      <w:pPr>
-        <w:spacing w:after="0"/>
-      </w:pPr>
-      <w:r>
-        <w:rPr>
-          <w:rFonts w:ascii="Consolas" w:hAnsi="Consolas" w:eastAsia="微软雅黑"/>
-          <w:b w:val="0"/>
-          <w:i w:val="0"/>
-          <w:color w:val="404040"/>
-          <w:sz w:val="18"/>
-        </w:rPr>
-        <w:t xml:space="preserve">    }</w:t>
-      </w:r>
-    </w:p>
-    <w:p>
-      <w:pPr>
-        <w:spacing w:after="0"/>
-      </w:pPr>
-      <w:r>
-        <w:rPr>
-          <w:rFonts w:ascii="Consolas" w:hAnsi="Consolas" w:eastAsia="微软雅黑"/>
-          <w:b w:val="0"/>
-          <w:i w:val="0"/>
-          <w:color w:val="404040"/>
-          <w:sz w:val="18"/>
-        </w:rPr>
-        <w:t xml:space="preserve"> </w:t>
-      </w:r>
-    </w:p>
-    <w:p>
-      <w:pPr>
-        <w:spacing w:after="0"/>
-      </w:pPr>
-      <w:r>
-        <w:rPr>
-          <w:rFonts w:ascii="Consolas" w:hAnsi="Consolas" w:eastAsia="微软雅黑"/>
-          <w:b w:val="0"/>
-          <w:i w:val="0"/>
-          <w:color w:val="404040"/>
-          <w:sz w:val="18"/>
-        </w:rPr>
-        <w:t xml:space="preserve">    CHANNELS {</w:t>
-      </w:r>
-    </w:p>
-    <w:p>
-      <w:pPr>
-        <w:spacing w:after="0"/>
-      </w:pPr>
-      <w:r>
-        <w:rPr>
-          <w:rFonts w:ascii="Consolas" w:hAnsi="Consolas" w:eastAsia="微软雅黑"/>
-          <w:b w:val="0"/>
-          <w:i w:val="0"/>
-          <w:color w:val="404040"/>
-          <w:sz w:val="18"/>
-        </w:rPr>
-        <w:t xml:space="preserve">        int channel_id "渠道ID(主键)"</w:t>
-      </w:r>
-    </w:p>
-    <w:p>
-      <w:pPr>
-        <w:spacing w:after="0"/>
-      </w:pPr>
-      <w:r>
-        <w:rPr>
-          <w:rFonts w:ascii="Consolas" w:hAnsi="Consolas" w:eastAsia="微软雅黑"/>
-          <w:b w:val="0"/>
-          <w:i w:val="0"/>
-          <w:color w:val="404040"/>
-          <w:sz w:val="18"/>
-        </w:rPr>
-        <w:t xml:space="preserve">        string channel_name "标准渠道名(母集)"</w:t>
-      </w:r>
-    </w:p>
-    <w:p>
-      <w:pPr>
-        <w:spacing w:after="0"/>
-      </w:pPr>
-      <w:r>
-        <w:rPr>
-          <w:rFonts w:ascii="Consolas" w:hAnsi="Consolas" w:eastAsia="微软雅黑"/>
-          <w:b w:val="0"/>
-          <w:i w:val="0"/>
-          <w:color w:val="404040"/>
-          <w:sz w:val="18"/>
-        </w:rPr>
-        <w:t xml:space="preserve">        string channel_alias "渠道别名"</w:t>
-      </w:r>
-    </w:p>
-    <w:p>
-      <w:pPr>
-        <w:spacing w:after="0"/>
-      </w:pPr>
-      <w:r>
-        <w:rPr>
-          <w:rFonts w:ascii="Consolas" w:hAnsi="Consolas" w:eastAsia="微软雅黑"/>
-          <w:b w:val="0"/>
-          <w:i w:val="0"/>
-          <w:color w:val="404040"/>
-          <w:sz w:val="18"/>
-        </w:rPr>
-        <w:t xml:space="preserve">        string supplier_code "所属供应商"</w:t>
-      </w:r>
-    </w:p>
-    <w:p>
-      <w:pPr>
-        <w:spacing w:after="0"/>
-      </w:pPr>
-      <w:r>
-        <w:rPr>
-          <w:rFonts w:ascii="Consolas" w:hAnsi="Consolas" w:eastAsia="微软雅黑"/>
-          <w:b w:val="0"/>
-          <w:i w:val="0"/>
-          <w:color w:val="404040"/>
-          <w:sz w:val="18"/>
-        </w:rPr>
-        <w:t xml:space="preserve">        string line_type "线路(US/EU/CA)"</w:t>
-      </w:r>
-    </w:p>
-    <w:p>
-      <w:pPr>
-        <w:spacing w:after="0"/>
-      </w:pPr>
-      <w:r>
-        <w:rPr>
-          <w:rFonts w:ascii="Consolas" w:hAnsi="Consolas" w:eastAsia="微软雅黑"/>
-          <w:b w:val="0"/>
-          <w:i w:val="0"/>
-          <w:color w:val="404040"/>
-          <w:sz w:val="18"/>
-        </w:rPr>
-        <w:t xml:space="preserve">        string shipping_mode "运输模式(sea/air/rail/truck)"</w:t>
-      </w:r>
-    </w:p>
-    <w:p>
-      <w:pPr>
-        <w:spacing w:after="0"/>
-      </w:pPr>
-      <w:r>
-        <w:rPr>
-          <w:rFonts w:ascii="Consolas" w:hAnsi="Consolas" w:eastAsia="微软雅黑"/>
-          <w:b w:val="0"/>
-          <w:i w:val="0"/>
-          <w:color w:val="404040"/>
-          <w:sz w:val="18"/>
-        </w:rPr>
-        <w:t xml:space="preserve">        string raw_channel_name "原始渠道名"</w:t>
-      </w:r>
-    </w:p>
-    <w:p>
-      <w:pPr>
-        <w:spacing w:after="0"/>
-      </w:pPr>
-      <w:r>
-        <w:rPr>
-          <w:rFonts w:ascii="Consolas" w:hAnsi="Consolas" w:eastAsia="微软雅黑"/>
-          <w:b w:val="0"/>
-          <w:i w:val="0"/>
-          <w:color w:val="404040"/>
-          <w:sz w:val="18"/>
-        </w:rPr>
-        <w:t xml:space="preserve">    }</w:t>
-      </w:r>
-    </w:p>
-    <w:p>
-      <w:pPr>
-        <w:spacing w:after="0"/>
-      </w:pPr>
-      <w:r>
-        <w:rPr>
-          <w:rFonts w:ascii="Consolas" w:hAnsi="Consolas" w:eastAsia="微软雅黑"/>
-          <w:b w:val="0"/>
-          <w:i w:val="0"/>
-          <w:color w:val="404040"/>
-          <w:sz w:val="18"/>
-        </w:rPr>
-        <w:t xml:space="preserve"> </w:t>
-      </w:r>
-    </w:p>
-    <w:p>
-      <w:pPr>
-        <w:spacing w:after="0"/>
-      </w:pPr>
-      <w:r>
-        <w:rPr>
-          <w:rFonts w:ascii="Consolas" w:hAnsi="Consolas" w:eastAsia="微软雅黑"/>
-          <w:b w:val="0"/>
-          <w:i w:val="0"/>
-          <w:color w:val="404040"/>
-          <w:sz w:val="18"/>
-        </w:rPr>
-        <w:t xml:space="preserve">    PRICES {</w:t>
-      </w:r>
-    </w:p>
-    <w:p>
-      <w:pPr>
-        <w:spacing w:after="0"/>
-      </w:pPr>
-      <w:r>
-        <w:rPr>
-          <w:rFonts w:ascii="Consolas" w:hAnsi="Consolas" w:eastAsia="微软雅黑"/>
-          <w:b w:val="0"/>
-          <w:i w:val="0"/>
-          <w:color w:val="404040"/>
-          <w:sz w:val="18"/>
-        </w:rPr>
-        <w:t xml:space="preserve">        int price_id "价格ID(主键)"</w:t>
-      </w:r>
-    </w:p>
-    <w:p>
-      <w:pPr>
-        <w:spacing w:after="0"/>
-      </w:pPr>
-      <w:r>
-        <w:rPr>
-          <w:rFonts w:ascii="Consolas" w:hAnsi="Consolas" w:eastAsia="微软雅黑"/>
-          <w:b w:val="0"/>
-          <w:i w:val="0"/>
-          <w:color w:val="404040"/>
-          <w:sz w:val="18"/>
-        </w:rPr>
-        <w:t xml:space="preserve">        string supplier_code "供应商"</w:t>
-      </w:r>
-    </w:p>
-    <w:p>
-      <w:pPr>
-        <w:spacing w:after="0"/>
-      </w:pPr>
-      <w:r>
-        <w:rPr>
-          <w:rFonts w:ascii="Consolas" w:hAnsi="Consolas" w:eastAsia="微软雅黑"/>
-          <w:b w:val="0"/>
-          <w:i w:val="0"/>
-          <w:color w:val="404040"/>
-          <w:sz w:val="18"/>
-        </w:rPr>
-        <w:t xml:space="preserve">        int channel_id "渠道(外键)"</w:t>
-      </w:r>
-    </w:p>
-    <w:p>
-      <w:pPr>
-        <w:spacing w:after="0"/>
-      </w:pPr>
-      <w:r>
-        <w:rPr>
-          <w:rFonts w:ascii="Consolas" w:hAnsi="Consolas" w:eastAsia="微软雅黑"/>
-          <w:b w:val="0"/>
-          <w:i w:val="0"/>
-          <w:color w:val="404040"/>
-          <w:sz w:val="18"/>
-        </w:rPr>
-        <w:t xml:space="preserve">        string destination_code "目的地/仓库代码"</w:t>
-      </w:r>
-    </w:p>
-    <w:p>
-      <w:pPr>
-        <w:spacing w:after="0"/>
-      </w:pPr>
-      <w:r>
-        <w:rPr>
-          <w:rFonts w:ascii="Consolas" w:hAnsi="Consolas" w:eastAsia="微软雅黑"/>
-          <w:b w:val="0"/>
-          <w:i w:val="0"/>
-          <w:color w:val="404040"/>
-          <w:sz w:val="18"/>
-        </w:rPr>
-        <w:t xml:space="preserve">        real weight_min "重量下限"</w:t>
-      </w:r>
-    </w:p>
-    <w:p>
-      <w:pPr>
-        <w:spacing w:after="0"/>
-      </w:pPr>
-      <w:r>
-        <w:rPr>
-          <w:rFonts w:ascii="Consolas" w:hAnsi="Consolas" w:eastAsia="微软雅黑"/>
-          <w:b w:val="0"/>
-          <w:i w:val="0"/>
-          <w:color w:val="404040"/>
-          <w:sz w:val="18"/>
-        </w:rPr>
-        <w:t xml:space="preserve">        real weight_max "重量上限"</w:t>
-      </w:r>
-    </w:p>
-    <w:p>
-      <w:pPr>
-        <w:spacing w:after="0"/>
-      </w:pPr>
-      <w:r>
-        <w:rPr>
-          <w:rFonts w:ascii="Consolas" w:hAnsi="Consolas" w:eastAsia="微软雅黑"/>
-          <w:b w:val="0"/>
-          <w:i w:val="0"/>
-          <w:color w:val="404040"/>
-          <w:sz w:val="18"/>
-        </w:rPr>
-        <w:t xml:space="preserve">        real rate "单价(底价)"</w:t>
-      </w:r>
-    </w:p>
-    <w:p>
-      <w:pPr>
-        <w:spacing w:after="0"/>
-      </w:pPr>
-      <w:r>
-        <w:rPr>
-          <w:rFonts w:ascii="Consolas" w:hAnsi="Consolas" w:eastAsia="微软雅黑"/>
-          <w:b w:val="0"/>
-          <w:i w:val="0"/>
-          <w:color w:val="404040"/>
-          <w:sz w:val="18"/>
-        </w:rPr>
-        <w:t xml:space="preserve">        string unit "计费单位(per_kg/per_cbm)"</w:t>
-      </w:r>
-    </w:p>
-    <w:p>
-      <w:pPr>
-        <w:spacing w:after="0"/>
-      </w:pPr>
-      <w:r>
-        <w:rPr>
-          <w:rFonts w:ascii="Consolas" w:hAnsi="Consolas" w:eastAsia="微软雅黑"/>
-          <w:b w:val="0"/>
-          <w:i w:val="0"/>
-          <w:color w:val="404040"/>
-          <w:sz w:val="18"/>
-        </w:rPr>
-        <w:t xml:space="preserve">        string dd_type "税费类型(DDP/DDU)"</w:t>
-      </w:r>
-    </w:p>
-    <w:p>
-      <w:pPr>
-        <w:spacing w:after="0"/>
-      </w:pPr>
-      <w:r>
-        <w:rPr>
-          <w:rFonts w:ascii="Consolas" w:hAnsi="Consolas" w:eastAsia="微软雅黑"/>
-          <w:b w:val="0"/>
-          <w:i w:val="0"/>
-          <w:color w:val="404040"/>
-          <w:sz w:val="18"/>
-        </w:rPr>
-        <w:t xml:space="preserve">        int transit_days_min "时效下限(天)"</w:t>
-      </w:r>
-    </w:p>
-    <w:p>
-      <w:pPr>
-        <w:spacing w:after="0"/>
-      </w:pPr>
-      <w:r>
-        <w:rPr>
-          <w:rFonts w:ascii="Consolas" w:hAnsi="Consolas" w:eastAsia="微软雅黑"/>
-          <w:b w:val="0"/>
-          <w:i w:val="0"/>
-          <w:color w:val="404040"/>
-          <w:sz w:val="18"/>
-        </w:rPr>
-        <w:t xml:space="preserve">        int transit_days_max "时效上限(天)"</w:t>
-      </w:r>
-    </w:p>
-    <w:p>
-      <w:pPr>
-        <w:spacing w:after="0"/>
-      </w:pPr>
-      <w:r>
-        <w:rPr>
-          <w:rFonts w:ascii="Consolas" w:hAnsi="Consolas" w:eastAsia="微软雅黑"/>
-          <w:b w:val="0"/>
-          <w:i w:val="0"/>
-          <w:color w:val="404040"/>
-          <w:sz w:val="18"/>
-        </w:rPr>
-        <w:t xml:space="preserve">        string valid_from "生效日期"</w:t>
-      </w:r>
-    </w:p>
-    <w:p>
-      <w:pPr>
-        <w:spacing w:after="0"/>
-      </w:pPr>
-      <w:r>
-        <w:rPr>
-          <w:rFonts w:ascii="Consolas" w:hAnsi="Consolas" w:eastAsia="微软雅黑"/>
-          <w:b w:val="0"/>
-          <w:i w:val="0"/>
-          <w:color w:val="404040"/>
-          <w:sz w:val="18"/>
-        </w:rPr>
-        <w:t xml:space="preserve">        string inbound_point "进仓点"</w:t>
-      </w:r>
-    </w:p>
-    <w:p>
-      <w:pPr>
-        <w:spacing w:after="0"/>
-      </w:pPr>
-      <w:r>
-        <w:rPr>
-          <w:rFonts w:ascii="Consolas" w:hAnsi="Consolas" w:eastAsia="微软雅黑"/>
-          <w:b w:val="0"/>
-          <w:i w:val="0"/>
-          <w:color w:val="404040"/>
-          <w:sz w:val="18"/>
-        </w:rPr>
-        <w:t xml:space="preserve">        int is_active "是否活跃"</w:t>
-      </w:r>
-    </w:p>
-    <w:p>
-      <w:pPr>
-        <w:spacing w:after="0"/>
-      </w:pPr>
-      <w:r>
-        <w:rPr>
-          <w:rFonts w:ascii="Consolas" w:hAnsi="Consolas" w:eastAsia="微软雅黑"/>
-          <w:b w:val="0"/>
-          <w:i w:val="0"/>
-          <w:color w:val="404040"/>
-          <w:sz w:val="18"/>
-        </w:rPr>
-        <w:t xml:space="preserve">    }</w:t>
-      </w:r>
-    </w:p>
-    <w:p>
-      <w:pPr>
-        <w:spacing w:after="0"/>
-      </w:pPr>
-      <w:r>
-        <w:rPr>
-          <w:rFonts w:ascii="Consolas" w:hAnsi="Consolas" w:eastAsia="微软雅黑"/>
-          <w:b w:val="0"/>
-          <w:i w:val="0"/>
-          <w:color w:val="404040"/>
-          <w:sz w:val="18"/>
-        </w:rPr>
-        <w:t xml:space="preserve"> </w:t>
-      </w:r>
-    </w:p>
-    <w:p>
-      <w:pPr>
-        <w:spacing w:after="0"/>
-      </w:pPr>
-      <w:r>
-        <w:rPr>
-          <w:rFonts w:ascii="Consolas" w:hAnsi="Consolas" w:eastAsia="微软雅黑"/>
-          <w:b w:val="0"/>
-          <w:i w:val="0"/>
-          <w:color w:val="404040"/>
-          <w:sz w:val="18"/>
-        </w:rPr>
-        <w:t xml:space="preserve">    SCHEDULES {</w:t>
-      </w:r>
-    </w:p>
-    <w:p>
-      <w:pPr>
-        <w:spacing w:after="0"/>
-      </w:pPr>
-      <w:r>
-        <w:rPr>
-          <w:rFonts w:ascii="Consolas" w:hAnsi="Consolas" w:eastAsia="微软雅黑"/>
-          <w:b w:val="0"/>
-          <w:i w:val="0"/>
-          <w:color w:val="404040"/>
-          <w:sz w:val="18"/>
-        </w:rPr>
-        <w:t xml:space="preserve">        int schedule_id "船期ID(主键)"</w:t>
-      </w:r>
-    </w:p>
-    <w:p>
-      <w:pPr>
-        <w:spacing w:after="0"/>
-      </w:pPr>
-      <w:r>
-        <w:rPr>
-          <w:rFonts w:ascii="Consolas" w:hAnsi="Consolas" w:eastAsia="微软雅黑"/>
-          <w:b w:val="0"/>
-          <w:i w:val="0"/>
-          <w:color w:val="404040"/>
-          <w:sz w:val="18"/>
-        </w:rPr>
-        <w:t xml:space="preserve">        string supplier_code "供应商"</w:t>
-      </w:r>
-    </w:p>
-    <w:p>
-      <w:pPr>
-        <w:spacing w:after="0"/>
-      </w:pPr>
-      <w:r>
-        <w:rPr>
-          <w:rFonts w:ascii="Consolas" w:hAnsi="Consolas" w:eastAsia="微软雅黑"/>
-          <w:b w:val="0"/>
-          <w:i w:val="0"/>
-          <w:color w:val="404040"/>
-          <w:sz w:val="18"/>
-        </w:rPr>
-        <w:t xml:space="preserve">        int channel_id "渠道(外键)"</w:t>
-      </w:r>
-    </w:p>
-    <w:p>
-      <w:pPr>
-        <w:spacing w:after="0"/>
-      </w:pPr>
-      <w:r>
-        <w:rPr>
-          <w:rFonts w:ascii="Consolas" w:hAnsi="Consolas" w:eastAsia="微软雅黑"/>
-          <w:b w:val="0"/>
-          <w:i w:val="0"/>
-          <w:color w:val="404040"/>
-          <w:sz w:val="18"/>
-        </w:rPr>
-        <w:t xml:space="preserve">        string loading_port "装货港"</w:t>
-      </w:r>
-    </w:p>
-    <w:p>
-      <w:pPr>
-        <w:spacing w:after="0"/>
-      </w:pPr>
-      <w:r>
-        <w:rPr>
-          <w:rFonts w:ascii="Consolas" w:hAnsi="Consolas" w:eastAsia="微软雅黑"/>
-          <w:b w:val="0"/>
-          <w:i w:val="0"/>
-          <w:color w:val="404040"/>
-          <w:sz w:val="18"/>
-        </w:rPr>
-        <w:t xml:space="preserve">        string vessel_name "船名/航次"</w:t>
-      </w:r>
-    </w:p>
-    <w:p>
-      <w:pPr>
-        <w:spacing w:after="0"/>
-      </w:pPr>
-      <w:r>
-        <w:rPr>
-          <w:rFonts w:ascii="Consolas" w:hAnsi="Consolas" w:eastAsia="微软雅黑"/>
-          <w:b w:val="0"/>
-          <w:i w:val="0"/>
-          <w:color w:val="404040"/>
-          <w:sz w:val="18"/>
-        </w:rPr>
-        <w:t xml:space="preserve">        date cutoff_date "截单日期"</w:t>
-      </w:r>
-    </w:p>
-    <w:p>
-      <w:pPr>
-        <w:spacing w:after="0"/>
-      </w:pPr>
-      <w:r>
-        <w:rPr>
-          <w:rFonts w:ascii="Consolas" w:hAnsi="Consolas" w:eastAsia="微软雅黑"/>
-          <w:b w:val="0"/>
-          <w:i w:val="0"/>
-          <w:color w:val="404040"/>
-          <w:sz w:val="18"/>
-        </w:rPr>
-        <w:t xml:space="preserve">        date sailing_date "开船日期"</w:t>
-      </w:r>
-    </w:p>
-    <w:p>
-      <w:pPr>
-        <w:spacing w:after="0"/>
-      </w:pPr>
-      <w:r>
-        <w:rPr>
-          <w:rFonts w:ascii="Consolas" w:hAnsi="Consolas" w:eastAsia="微软雅黑"/>
-          <w:b w:val="0"/>
-          <w:i w:val="0"/>
-          <w:color w:val="404040"/>
-          <w:sz w:val="18"/>
-        </w:rPr>
-        <w:t xml:space="preserve">        date arrival_date "到港日期"</w:t>
-      </w:r>
-    </w:p>
-    <w:p>
-      <w:pPr>
-        <w:spacing w:after="0"/>
-      </w:pPr>
-      <w:r>
-        <w:rPr>
-          <w:rFonts w:ascii="Consolas" w:hAnsi="Consolas" w:eastAsia="微软雅黑"/>
-          <w:b w:val="0"/>
-          <w:i w:val="0"/>
-          <w:color w:val="404040"/>
-          <w:sz w:val="18"/>
-        </w:rPr>
-        <w:t xml:space="preserve">        string weekly_pattern "周模式(每周X截Y开)"</w:t>
-      </w:r>
-    </w:p>
-    <w:p>
-      <w:pPr>
-        <w:spacing w:after="0"/>
-      </w:pPr>
-      <w:r>
-        <w:rPr>
-          <w:rFonts w:ascii="Consolas" w:hAnsi="Consolas" w:eastAsia="微软雅黑"/>
-          <w:b w:val="0"/>
-          <w:i w:val="0"/>
-          <w:color w:val="404040"/>
-          <w:sz w:val="18"/>
-        </w:rPr>
-        <w:t xml:space="preserve">    }</w:t>
-      </w:r>
-    </w:p>
-    <w:p>
-      <w:pPr>
-        <w:spacing w:after="0"/>
-      </w:pPr>
-      <w:r>
-        <w:rPr>
-          <w:rFonts w:ascii="Consolas" w:hAnsi="Consolas" w:eastAsia="微软雅黑"/>
-          <w:b w:val="0"/>
-          <w:i w:val="0"/>
-          <w:color w:val="404040"/>
-          <w:sz w:val="18"/>
-        </w:rPr>
-        <w:t xml:space="preserve"> </w:t>
-      </w:r>
-    </w:p>
-    <w:p>
-      <w:pPr>
-        <w:spacing w:after="0"/>
-      </w:pPr>
-      <w:r>
-        <w:rPr>
-          <w:rFonts w:ascii="Consolas" w:hAnsi="Consolas" w:eastAsia="微软雅黑"/>
-          <w:b w:val="0"/>
-          <w:i w:val="0"/>
-          <w:color w:val="404040"/>
-          <w:sz w:val="18"/>
-        </w:rPr>
-        <w:t xml:space="preserve">    BILLING_RULES {</w:t>
-      </w:r>
-    </w:p>
-    <w:p>
-      <w:pPr>
-        <w:spacing w:after="0"/>
-      </w:pPr>
-      <w:r>
-        <w:rPr>
-          <w:rFonts w:ascii="Consolas" w:hAnsi="Consolas" w:eastAsia="微软雅黑"/>
-          <w:b w:val="0"/>
-          <w:i w:val="0"/>
-          <w:color w:val="404040"/>
-          <w:sz w:val="18"/>
-        </w:rPr>
-        <w:t xml:space="preserve">        int rule_id "规则ID(主键)"</w:t>
-      </w:r>
-    </w:p>
-    <w:p>
-      <w:pPr>
-        <w:spacing w:after="0"/>
-      </w:pPr>
-      <w:r>
-        <w:rPr>
-          <w:rFonts w:ascii="Consolas" w:hAnsi="Consolas" w:eastAsia="微软雅黑"/>
-          <w:b w:val="0"/>
-          <w:i w:val="0"/>
-          <w:color w:val="404040"/>
-          <w:sz w:val="18"/>
-        </w:rPr>
-        <w:t xml:space="preserve">        string supplier_code "供应商"</w:t>
-      </w:r>
-    </w:p>
-    <w:p>
-      <w:pPr>
-        <w:spacing w:after="0"/>
-      </w:pPr>
-      <w:r>
-        <w:rPr>
-          <w:rFonts w:ascii="Consolas" w:hAnsi="Consolas" w:eastAsia="微软雅黑"/>
-          <w:b w:val="0"/>
-          <w:i w:val="0"/>
-          <w:color w:val="404040"/>
-          <w:sz w:val="18"/>
-        </w:rPr>
-        <w:t xml:space="preserve">        string service_type "服务类型"</w:t>
-      </w:r>
-    </w:p>
-    <w:p>
-      <w:pPr>
-        <w:spacing w:after="0"/>
-      </w:pPr>
-      <w:r>
-        <w:rPr>
-          <w:rFonts w:ascii="Consolas" w:hAnsi="Consolas" w:eastAsia="微软雅黑"/>
-          <w:b w:val="0"/>
-          <w:i w:val="0"/>
-          <w:color w:val="404040"/>
-          <w:sz w:val="18"/>
-        </w:rPr>
-        <w:t xml:space="preserve">        string channel_group "渠道组"</w:t>
-      </w:r>
-    </w:p>
-    <w:p>
-      <w:pPr>
-        <w:spacing w:after="0"/>
-      </w:pPr>
-      <w:r>
-        <w:rPr>
-          <w:rFonts w:ascii="Consolas" w:hAnsi="Consolas" w:eastAsia="微软雅黑"/>
-          <w:b w:val="0"/>
-          <w:i w:val="0"/>
-          <w:color w:val="404040"/>
-          <w:sz w:val="18"/>
-        </w:rPr>
-        <w:t xml:space="preserve">        string category "规则类别"</w:t>
-      </w:r>
-    </w:p>
-    <w:p>
-      <w:pPr>
-        <w:spacing w:after="0"/>
-      </w:pPr>
-      <w:r>
-        <w:rPr>
-          <w:rFonts w:ascii="Consolas" w:hAnsi="Consolas" w:eastAsia="微软雅黑"/>
-          <w:b w:val="0"/>
-          <w:i w:val="0"/>
-          <w:color w:val="404040"/>
-          <w:sz w:val="18"/>
-        </w:rPr>
-        <w:t xml:space="preserve">        real min_weight_kg "计费门槛"</w:t>
-      </w:r>
-    </w:p>
-    <w:p>
-      <w:pPr>
-        <w:spacing w:after="0"/>
-      </w:pPr>
-      <w:r>
-        <w:rPr>
-          <w:rFonts w:ascii="Consolas" w:hAnsi="Consolas" w:eastAsia="微软雅黑"/>
-          <w:b w:val="0"/>
-          <w:i w:val="0"/>
-          <w:color w:val="404040"/>
-          <w:sz w:val="18"/>
-        </w:rPr>
-        <w:t xml:space="preserve">        real discount_amount "折扣/附加费金额"</w:t>
-      </w:r>
-    </w:p>
-    <w:p>
-      <w:pPr>
-        <w:spacing w:after="0"/>
-      </w:pPr>
-      <w:r>
-        <w:rPr>
-          <w:rFonts w:ascii="Consolas" w:hAnsi="Consolas" w:eastAsia="微软雅黑"/>
-          <w:b w:val="0"/>
-          <w:i w:val="0"/>
-          <w:color w:val="404040"/>
-          <w:sz w:val="18"/>
-        </w:rPr>
-        <w:t xml:space="preserve">        string cost_formula "计费公式"</w:t>
-      </w:r>
-    </w:p>
-    <w:p>
-      <w:pPr>
-        <w:spacing w:after="0"/>
-      </w:pPr>
-      <w:r>
-        <w:rPr>
-          <w:rFonts w:ascii="Consolas" w:hAnsi="Consolas" w:eastAsia="微软雅黑"/>
-          <w:b w:val="0"/>
-          <w:i w:val="0"/>
-          <w:color w:val="404040"/>
-          <w:sz w:val="18"/>
-        </w:rPr>
-        <w:t xml:space="preserve">        string condition_desc "触发条件"</w:t>
-      </w:r>
-    </w:p>
-    <w:p>
-      <w:pPr>
-        <w:spacing w:after="0"/>
-      </w:pPr>
-      <w:r>
-        <w:rPr>
-          <w:rFonts w:ascii="Consolas" w:hAnsi="Consolas" w:eastAsia="微软雅黑"/>
-          <w:b w:val="0"/>
-          <w:i w:val="0"/>
-          <w:color w:val="404040"/>
-          <w:sz w:val="18"/>
-        </w:rPr>
-        <w:t xml:space="preserve">    }</w:t>
-      </w:r>
-    </w:p>
-    <w:p>
-      <w:pPr>
-        <w:spacing w:after="0"/>
-      </w:pPr>
-      <w:r>
-        <w:rPr>
-          <w:rFonts w:ascii="Consolas" w:hAnsi="Consolas" w:eastAsia="微软雅黑"/>
-          <w:b w:val="0"/>
-          <w:i w:val="0"/>
-          <w:color w:val="404040"/>
-          <w:sz w:val="18"/>
-        </w:rPr>
-        <w:t xml:space="preserve"> </w:t>
-      </w:r>
-    </w:p>
-    <w:p>
-      <w:pPr>
-        <w:spacing w:after="0"/>
-      </w:pPr>
-      <w:r>
-        <w:rPr>
-          <w:rFonts w:ascii="Consolas" w:hAnsi="Consolas" w:eastAsia="微软雅黑"/>
-          <w:b w:val="0"/>
-          <w:i w:val="0"/>
-          <w:color w:val="404040"/>
-          <w:sz w:val="18"/>
-        </w:rPr>
-        <w:t xml:space="preserve">    DESTINATIONS {</w:t>
-      </w:r>
-    </w:p>
-    <w:p>
-      <w:pPr>
-        <w:spacing w:after="0"/>
-      </w:pPr>
-      <w:r>
-        <w:rPr>
-          <w:rFonts w:ascii="Consolas" w:hAnsi="Consolas" w:eastAsia="微软雅黑"/>
-          <w:b w:val="0"/>
-          <w:i w:val="0"/>
-          <w:color w:val="404040"/>
-          <w:sz w:val="18"/>
-        </w:rPr>
-        <w:t xml:space="preserve">        string code "目的地代码(主键)"</w:t>
-      </w:r>
-    </w:p>
-    <w:p>
-      <w:pPr>
-        <w:spacing w:after="0"/>
-      </w:pPr>
-      <w:r>
-        <w:rPr>
-          <w:rFonts w:ascii="Consolas" w:hAnsi="Consolas" w:eastAsia="微软雅黑"/>
-          <w:b w:val="0"/>
-          <w:i w:val="0"/>
-          <w:color w:val="404040"/>
-          <w:sz w:val="18"/>
-        </w:rPr>
-        <w:t xml:space="preserve">        string name "名称"</w:t>
-      </w:r>
-    </w:p>
-    <w:p>
-      <w:pPr>
-        <w:spacing w:after="0"/>
-      </w:pPr>
-      <w:r>
-        <w:rPr>
-          <w:rFonts w:ascii="Consolas" w:hAnsi="Consolas" w:eastAsia="微软雅黑"/>
-          <w:b w:val="0"/>
-          <w:i w:val="0"/>
-          <w:color w:val="404040"/>
-          <w:sz w:val="18"/>
-        </w:rPr>
-        <w:t xml:space="preserve">        string type "类型(FBA仓/区域/港口/国家)"</w:t>
-      </w:r>
-    </w:p>
-    <w:p>
-      <w:pPr>
-        <w:spacing w:after="0"/>
-      </w:pPr>
-      <w:r>
-        <w:rPr>
-          <w:rFonts w:ascii="Consolas" w:hAnsi="Consolas" w:eastAsia="微软雅黑"/>
-          <w:b w:val="0"/>
-          <w:i w:val="0"/>
-          <w:color w:val="404040"/>
-          <w:sz w:val="18"/>
-        </w:rPr>
-        <w:t xml:space="preserve">        string region "区域"</w:t>
-      </w:r>
-    </w:p>
-    <w:p>
-      <w:pPr>
-        <w:spacing w:after="0"/>
-      </w:pPr>
-      <w:r>
-        <w:rPr>
-          <w:rFonts w:ascii="Consolas" w:hAnsi="Consolas" w:eastAsia="微软雅黑"/>
-          <w:b w:val="0"/>
-          <w:i w:val="0"/>
-          <w:color w:val="404040"/>
-          <w:sz w:val="18"/>
-        </w:rPr>
-        <w:t xml:space="preserve">        string country "国家"</w:t>
-      </w:r>
-    </w:p>
-    <w:p>
-      <w:pPr>
-        <w:spacing w:after="0"/>
-      </w:pPr>
-      <w:r>
-        <w:rPr>
-          <w:rFonts w:ascii="Consolas" w:hAnsi="Consolas" w:eastAsia="微软雅黑"/>
-          <w:b w:val="0"/>
-          <w:i w:val="0"/>
-          <w:color w:val="404040"/>
-          <w:sz w:val="18"/>
-        </w:rPr>
-        <w:t xml:space="preserve">    }</w:t>
-      </w:r>
-    </w:p>
+    <w:p/>
     <w:p>
       <w:pPr>
         <w:spacing w:before="160" w:after="80"/>

</xml_diff>